<commit_message>
uploading class 14 masterclass
</commit_message>
<xml_diff>
--- a/Assignments/Assignment 3 - Iterative structures (for and while loops).docx
+++ b/Assignments/Assignment 3 - Iterative structures (for and while loops).docx
@@ -24,8 +24,6 @@
         </w:rPr>
         <w:t>Assignment # 03: Loops (Iterative</w:t>
       </w:r>
-      <w:bookmarkStart w:id="0" w:name="_GoBack"/>
-      <w:bookmarkEnd w:id="0"/>
       <w:r>
         <w:rPr>
           <w:rFonts w:asciiTheme="majorHAnsi" w:hAnsiTheme="majorHAnsi" w:cstheme="majorHAnsi"/>
@@ -185,6 +183,7 @@
         </w:rPr>
         <w:t>Insturctons</w:t>
       </w:r>
+      <w:proofErr w:type="spellEnd"/>
       <w:r>
         <w:rPr>
           <w:color w:val="002060"/>
@@ -193,7 +192,6 @@
         </w:rPr>
         <w:t>:</w:t>
       </w:r>
-      <w:proofErr w:type="spellEnd"/>
     </w:p>
     <w:p>
       <w:pPr>
@@ -558,7 +556,31 @@
         <w:rPr>
           <w:rFonts w:ascii="Cambria" w:hAnsi="Cambria"/>
         </w:rPr>
-        <w:t>Write a program to print numbers from 1 to 30 using for loop.</w:t>
+        <w:t>Write a program to prin</w:t>
+      </w:r>
+      <w:r>
+        <w:rPr>
+          <w:rFonts w:ascii="Cambria" w:hAnsi="Cambria"/>
+        </w:rPr>
+        <w:t>t numbers from 1 to 30 using for and while</w:t>
+      </w:r>
+      <w:r>
+        <w:rPr>
+          <w:rFonts w:ascii="Cambria" w:hAnsi="Cambria"/>
+        </w:rPr>
+        <w:t xml:space="preserve"> loop</w:t>
+      </w:r>
+      <w:r>
+        <w:rPr>
+          <w:rFonts w:ascii="Cambria" w:hAnsi="Cambria"/>
+        </w:rPr>
+        <w:t>s</w:t>
+      </w:r>
+      <w:r>
+        <w:rPr>
+          <w:rFonts w:ascii="Cambria" w:hAnsi="Cambria"/>
+        </w:rPr>
+        <w:t>.</w:t>
       </w:r>
     </w:p>
     <w:p>
@@ -578,7 +600,31 @@
         <w:rPr>
           <w:rFonts w:ascii="Cambria" w:hAnsi="Cambria"/>
         </w:rPr>
-        <w:t>Write a program to print even numbers from 1 to 50 using while loop.</w:t>
+        <w:t xml:space="preserve">Write a program to print even numbers from 1 to 50 using </w:t>
+      </w:r>
+      <w:r>
+        <w:rPr>
+          <w:rFonts w:ascii="Cambria" w:hAnsi="Cambria"/>
+        </w:rPr>
+        <w:t>for and while</w:t>
+      </w:r>
+      <w:r>
+        <w:rPr>
+          <w:rFonts w:ascii="Cambria" w:hAnsi="Cambria"/>
+        </w:rPr>
+        <w:t xml:space="preserve"> loop</w:t>
+      </w:r>
+      <w:r>
+        <w:rPr>
+          <w:rFonts w:ascii="Cambria" w:hAnsi="Cambria"/>
+        </w:rPr>
+        <w:t>s</w:t>
+      </w:r>
+      <w:r>
+        <w:rPr>
+          <w:rFonts w:ascii="Cambria" w:hAnsi="Cambria"/>
+        </w:rPr>
+        <w:t>.</w:t>
       </w:r>
     </w:p>
     <w:p>
@@ -598,7 +644,37 @@
         <w:rPr>
           <w:rFonts w:ascii="Cambria" w:hAnsi="Cambria"/>
         </w:rPr>
-        <w:t>Write a program to print multiplication table of a given number.</w:t>
+        <w:t>Write a program to print multiplication table of a given number</w:t>
+      </w:r>
+      <w:r>
+        <w:rPr>
+          <w:rFonts w:ascii="Cambria" w:hAnsi="Cambria"/>
+        </w:rPr>
+        <w:t xml:space="preserve"> </w:t>
+      </w:r>
+      <w:r>
+        <w:rPr>
+          <w:rFonts w:ascii="Cambria" w:hAnsi="Cambria"/>
+        </w:rPr>
+        <w:t>for and while</w:t>
+      </w:r>
+      <w:r>
+        <w:rPr>
+          <w:rFonts w:ascii="Cambria" w:hAnsi="Cambria"/>
+        </w:rPr>
+        <w:t xml:space="preserve"> loop</w:t>
+      </w:r>
+      <w:r>
+        <w:rPr>
+          <w:rFonts w:ascii="Cambria" w:hAnsi="Cambria"/>
+        </w:rPr>
+        <w:t>s</w:t>
+      </w:r>
+      <w:r>
+        <w:rPr>
+          <w:rFonts w:ascii="Cambria" w:hAnsi="Cambria"/>
+        </w:rPr>
+        <w:t>.</w:t>
       </w:r>
     </w:p>
     <w:p>
@@ -618,7 +694,31 @@
         <w:rPr>
           <w:rFonts w:ascii="Cambria" w:hAnsi="Cambria"/>
         </w:rPr>
-        <w:t>Write a program to print odd numbers from 1 to 50 using while loop.</w:t>
+        <w:t xml:space="preserve">Write a program to print odd numbers from 1 to 50 using </w:t>
+      </w:r>
+      <w:r>
+        <w:rPr>
+          <w:rFonts w:ascii="Cambria" w:hAnsi="Cambria"/>
+        </w:rPr>
+        <w:t>for and while</w:t>
+      </w:r>
+      <w:r>
+        <w:rPr>
+          <w:rFonts w:ascii="Cambria" w:hAnsi="Cambria"/>
+        </w:rPr>
+        <w:t xml:space="preserve"> loop</w:t>
+      </w:r>
+      <w:r>
+        <w:rPr>
+          <w:rFonts w:ascii="Cambria" w:hAnsi="Cambria"/>
+        </w:rPr>
+        <w:t>s</w:t>
+      </w:r>
+      <w:r>
+        <w:rPr>
+          <w:rFonts w:ascii="Cambria" w:hAnsi="Cambria"/>
+        </w:rPr>
+        <w:t>.</w:t>
       </w:r>
     </w:p>
     <w:p>
@@ -638,7 +738,25 @@
         <w:rPr>
           <w:rFonts w:ascii="Cambria" w:hAnsi="Cambria"/>
         </w:rPr>
-        <w:t>Write a program to calculate the sum of all numbers from 1 to 50 using for loop.</w:t>
+        <w:t xml:space="preserve">Write a program to calculate the sum of all numbers from 1 to 50 using </w:t>
+      </w:r>
+      <w:r>
+        <w:rPr>
+          <w:rFonts w:ascii="Cambria" w:hAnsi="Cambria"/>
+        </w:rPr>
+        <w:t>for and while</w:t>
+      </w:r>
+      <w:r>
+        <w:rPr>
+          <w:rFonts w:ascii="Cambria" w:hAnsi="Cambria"/>
+        </w:rPr>
+        <w:t xml:space="preserve"> loop</w:t>
+      </w:r>
+      <w:r>
+        <w:rPr>
+          <w:rFonts w:ascii="Cambria" w:hAnsi="Cambria"/>
+        </w:rPr>
+        <w:t>s</w:t>
       </w:r>
     </w:p>
     <w:p>
@@ -658,7 +776,37 @@
         <w:rPr>
           <w:rFonts w:ascii="Cambria" w:hAnsi="Cambria"/>
         </w:rPr>
-        <w:t>Write a program to print each character of a string.</w:t>
+        <w:t>Write a program to print each character of a string</w:t>
+      </w:r>
+      <w:r>
+        <w:rPr>
+          <w:rFonts w:ascii="Cambria" w:hAnsi="Cambria"/>
+        </w:rPr>
+        <w:t xml:space="preserve"> </w:t>
+      </w:r>
+      <w:r>
+        <w:rPr>
+          <w:rFonts w:ascii="Cambria" w:hAnsi="Cambria"/>
+        </w:rPr>
+        <w:t>for and while</w:t>
+      </w:r>
+      <w:r>
+        <w:rPr>
+          <w:rFonts w:ascii="Cambria" w:hAnsi="Cambria"/>
+        </w:rPr>
+        <w:t xml:space="preserve"> loop</w:t>
+      </w:r>
+      <w:r>
+        <w:rPr>
+          <w:rFonts w:ascii="Cambria" w:hAnsi="Cambria"/>
+        </w:rPr>
+        <w:t>s</w:t>
+      </w:r>
+      <w:r>
+        <w:rPr>
+          <w:rFonts w:ascii="Cambria" w:hAnsi="Cambria"/>
+        </w:rPr>
+        <w:t>.</w:t>
       </w:r>
     </w:p>
     <w:p>
@@ -678,7 +826,25 @@
         <w:rPr>
           <w:rFonts w:ascii="Cambria" w:hAnsi="Cambria"/>
         </w:rPr>
-        <w:t>Write a program to compute the factorial of a number using while loop.</w:t>
+        <w:t xml:space="preserve">Write a program to compute the factorial of a number using </w:t>
+      </w:r>
+      <w:r>
+        <w:rPr>
+          <w:rFonts w:ascii="Cambria" w:hAnsi="Cambria"/>
+        </w:rPr>
+        <w:t>for and while</w:t>
+      </w:r>
+      <w:r>
+        <w:rPr>
+          <w:rFonts w:ascii="Cambria" w:hAnsi="Cambria"/>
+        </w:rPr>
+        <w:t xml:space="preserve"> loop</w:t>
+      </w:r>
+      <w:r>
+        <w:rPr>
+          <w:rFonts w:ascii="Cambria" w:hAnsi="Cambria"/>
+        </w:rPr>
+        <w:t>s</w:t>
       </w:r>
     </w:p>
     <w:p>
@@ -698,7 +864,37 @@
         <w:rPr>
           <w:rFonts w:ascii="Cambria" w:hAnsi="Cambria"/>
         </w:rPr>
-        <w:t>Write a program to print numbers from 10 down to 1.</w:t>
+        <w:t>Write a program to print numbers from 10 down to 1</w:t>
+      </w:r>
+      <w:r>
+        <w:rPr>
+          <w:rFonts w:ascii="Cambria" w:hAnsi="Cambria"/>
+        </w:rPr>
+        <w:t xml:space="preserve"> using </w:t>
+      </w:r>
+      <w:r>
+        <w:rPr>
+          <w:rFonts w:ascii="Cambria" w:hAnsi="Cambria"/>
+        </w:rPr>
+        <w:t>for and while</w:t>
+      </w:r>
+      <w:r>
+        <w:rPr>
+          <w:rFonts w:ascii="Cambria" w:hAnsi="Cambria"/>
+        </w:rPr>
+        <w:t xml:space="preserve"> loop</w:t>
+      </w:r>
+      <w:r>
+        <w:rPr>
+          <w:rFonts w:ascii="Cambria" w:hAnsi="Cambria"/>
+        </w:rPr>
+        <w:t>s</w:t>
+      </w:r>
+      <w:r>
+        <w:rPr>
+          <w:rFonts w:ascii="Cambria" w:hAnsi="Cambria"/>
+        </w:rPr>
+        <w:t>.</w:t>
       </w:r>
     </w:p>
     <w:p>
@@ -756,7 +952,37 @@
           <w:rFonts w:ascii="Cambria" w:hAnsi="Cambria"/>
         </w:rPr>
         <w:lastRenderedPageBreak/>
-        <w:t>Write a program that continues to ask user to input password until the correct password is entered.</w:t>
+        <w:t>Write a program that continues to ask user to input password until the correct password is entered</w:t>
+      </w:r>
+      <w:r>
+        <w:rPr>
+          <w:rFonts w:ascii="Cambria" w:hAnsi="Cambria"/>
+        </w:rPr>
+        <w:t xml:space="preserve"> using </w:t>
+      </w:r>
+      <w:r>
+        <w:rPr>
+          <w:rFonts w:ascii="Cambria" w:hAnsi="Cambria"/>
+        </w:rPr>
+        <w:t>for and while</w:t>
+      </w:r>
+      <w:r>
+        <w:rPr>
+          <w:rFonts w:ascii="Cambria" w:hAnsi="Cambria"/>
+        </w:rPr>
+        <w:t xml:space="preserve"> loop</w:t>
+      </w:r>
+      <w:r>
+        <w:rPr>
+          <w:rFonts w:ascii="Cambria" w:hAnsi="Cambria"/>
+        </w:rPr>
+        <w:t>s</w:t>
+      </w:r>
+      <w:r>
+        <w:rPr>
+          <w:rFonts w:ascii="Cambria" w:hAnsi="Cambria"/>
+        </w:rPr>
+        <w:t>.</w:t>
       </w:r>
     </w:p>
     <w:p>
@@ -776,7 +1002,37 @@
         <w:rPr>
           <w:rFonts w:ascii="Cambria" w:hAnsi="Cambria"/>
         </w:rPr>
-        <w:t>Write a program to print the square of each number from 1 to 10 using for loop.</w:t>
+        <w:t>Write a program to print the square of each nu</w:t>
+      </w:r>
+      <w:r>
+        <w:rPr>
+          <w:rFonts w:ascii="Cambria" w:hAnsi="Cambria"/>
+        </w:rPr>
+        <w:t xml:space="preserve">mber from 1 to 10 using </w:t>
+      </w:r>
+      <w:r>
+        <w:rPr>
+          <w:rFonts w:ascii="Cambria" w:hAnsi="Cambria"/>
+        </w:rPr>
+        <w:t>for and while</w:t>
+      </w:r>
+      <w:r>
+        <w:rPr>
+          <w:rFonts w:ascii="Cambria" w:hAnsi="Cambria"/>
+        </w:rPr>
+        <w:t xml:space="preserve"> loop</w:t>
+      </w:r>
+      <w:r>
+        <w:rPr>
+          <w:rFonts w:ascii="Cambria" w:hAnsi="Cambria"/>
+        </w:rPr>
+        <w:t>s</w:t>
+      </w:r>
+      <w:r>
+        <w:rPr>
+          <w:rFonts w:ascii="Cambria" w:hAnsi="Cambria"/>
+        </w:rPr>
+        <w:t>.</w:t>
       </w:r>
     </w:p>
     <w:p>
@@ -853,19 +1109,7 @@
         <w:rPr>
           <w:rFonts w:ascii="Cambria" w:hAnsi="Cambria"/>
         </w:rPr>
-        <w:t>. The program should check whether a guest's name has already been entered.</w:t>
-      </w:r>
-      <w:r>
-        <w:rPr>
-          <w:rFonts w:ascii="Cambria" w:hAnsi="Cambria"/>
-        </w:rPr>
-        <w:t xml:space="preserve"> </w:t>
-      </w:r>
-      <w:r>
-        <w:rPr>
-          <w:rFonts w:ascii="Cambria" w:hAnsi="Cambria"/>
-        </w:rPr>
-        <w:t xml:space="preserve">Write a Python program that uses a </w:t>
+        <w:t xml:space="preserve">. The program should check whether a guest's name has already been entered. Write a Python program that uses a </w:t>
       </w:r>
       <w:r>
         <w:rPr>
@@ -982,19 +1226,7 @@
         <w:rPr>
           <w:rFonts w:ascii="Cambria" w:hAnsi="Cambria"/>
         </w:rPr>
-        <w:t>.</w:t>
-      </w:r>
-      <w:r>
-        <w:rPr>
-          <w:rFonts w:ascii="Cambria" w:hAnsi="Cambria"/>
-        </w:rPr>
-        <w:t xml:space="preserve"> </w:t>
-      </w:r>
-      <w:r>
-        <w:rPr>
-          <w:rFonts w:ascii="Cambria" w:hAnsi="Cambria"/>
-        </w:rPr>
-        <w:t xml:space="preserve">Write a Python program that uses </w:t>
+        <w:t xml:space="preserve">. Write a Python program that uses </w:t>
       </w:r>
       <w:proofErr w:type="gramStart"/>
       <w:r>
@@ -1098,7 +1330,17 @@
           <w:b/>
           <w:bCs/>
         </w:rPr>
-        <w:t>dawat</w:t>
+        <w:t>da</w:t>
+      </w:r>
+      <w:bookmarkStart w:id="0" w:name="_GoBack"/>
+      <w:bookmarkEnd w:id="0"/>
+      <w:r>
+        <w:rPr>
+          <w:rFonts w:ascii="Cambria" w:eastAsia="Times New Roman" w:hAnsi="Cambria" w:cs="Times New Roman"/>
+          <w:b/>
+          <w:bCs/>
+        </w:rPr>
+        <w:t>wat</w:t>
       </w:r>
       <w:proofErr w:type="spellEnd"/>
       <w:r>
@@ -2657,7 +2899,14 @@
         <w:rPr>
           <w:rFonts w:ascii="Cambria" w:eastAsia="Times New Roman" w:hAnsi="Cambria" w:cs="Times New Roman"/>
         </w:rPr>
-        <w:t>karein.</w:t>
+        <w:t>karein</w:t>
+      </w:r>
+      <w:proofErr w:type="spellEnd"/>
+      <w:r>
+        <w:rPr>
+          <w:rFonts w:ascii="Cambria" w:eastAsia="Times New Roman" w:hAnsi="Cambria" w:cs="Times New Roman"/>
+        </w:rPr>
+        <w:t>.</w:t>
       </w:r>
     </w:p>
     <w:p>
@@ -2673,6 +2922,7 @@
           <w:rFonts w:ascii="Cambria" w:eastAsia="Times New Roman" w:hAnsi="Cambria" w:cs="Times New Roman"/>
         </w:rPr>
       </w:pPr>
+      <w:proofErr w:type="spellStart"/>
       <w:r>
         <w:rPr>
           <w:rFonts w:ascii="Cambria" w:eastAsia="Times New Roman" w:hAnsi="Cambria" w:cs="Times New Roman"/>

</xml_diff>